<commit_message>
MatchMaker Conversation Quick Pick Update and Inactive icon update
</commit_message>
<xml_diff>
--- a/docs/LinkUp_MatchMaker_Web_QA_Test_Plan.docx
+++ b/docs/LinkUp_MatchMaker_Web_QA_Test_Plan.docx
@@ -2950,6 +2950,374 @@
           </w:p>
         </w:tc>
       </w:tr>
+      <w:tr>
+        <w:tc>
+          <w:p>
+            <w:r>
+              <w:rPr>
+                <w:sz w:val="20"/>
+                <w:szCs w:val="20"/>
+              </w:rPr>
+              <w:t xml:space="preserve">MM-QA-037</w:t>
+            </w:r>
+          </w:p>
+        </w:tc>
+        <w:tc>
+          <w:p>
+            <w:r>
+              <w:rPr>
+                <w:sz w:val="20"/>
+                <w:szCs w:val="20"/>
+              </w:rPr>
+              <w:t xml:space="preserve">Chat</w:t>
+            </w:r>
+          </w:p>
+        </w:tc>
+        <w:tc>
+          <w:p>
+            <w:r>
+              <w:rPr>
+                <w:sz w:val="20"/>
+                <w:szCs w:val="20"/>
+              </w:rPr>
+              <w:t xml:space="preserve">Quick picks entry on MatchMaker thread</w:t>
+            </w:r>
+          </w:p>
+        </w:tc>
+        <w:tc>
+          <w:p>
+            <w:r>
+              <w:rPr>
+                <w:sz w:val="20"/>
+                <w:szCs w:val="20"/>
+              </w:rPr>
+              <w:t xml:space="preserve">P0</w:t>
+            </w:r>
+          </w:p>
+        </w:tc>
+      </w:tr>
+      <w:tr>
+        <w:tc>
+          <w:p>
+            <w:r>
+              <w:rPr>
+                <w:sz w:val="20"/>
+                <w:szCs w:val="20"/>
+              </w:rPr>
+              <w:t xml:space="preserve">MM-QA-038</w:t>
+            </w:r>
+          </w:p>
+        </w:tc>
+        <w:tc>
+          <w:p>
+            <w:r>
+              <w:rPr>
+                <w:sz w:val="20"/>
+                <w:szCs w:val="20"/>
+              </w:rPr>
+              <w:t xml:space="preserve">Chat</w:t>
+            </w:r>
+          </w:p>
+        </w:tc>
+        <w:tc>
+          <w:p>
+            <w:r>
+              <w:rPr>
+                <w:sz w:val="20"/>
+                <w:szCs w:val="20"/>
+              </w:rPr>
+              <w:t xml:space="preserve">Empty chat helper</w:t>
+            </w:r>
+          </w:p>
+        </w:tc>
+        <w:tc>
+          <w:p>
+            <w:r>
+              <w:rPr>
+                <w:sz w:val="20"/>
+                <w:szCs w:val="20"/>
+              </w:rPr>
+              <w:t xml:space="preserve">P1</w:t>
+            </w:r>
+          </w:p>
+        </w:tc>
+      </w:tr>
+      <w:tr>
+        <w:tc>
+          <w:p>
+            <w:r>
+              <w:rPr>
+                <w:sz w:val="20"/>
+                <w:szCs w:val="20"/>
+              </w:rPr>
+              <w:t xml:space="preserve">MM-QA-039</w:t>
+            </w:r>
+          </w:p>
+        </w:tc>
+        <w:tc>
+          <w:p>
+            <w:r>
+              <w:rPr>
+                <w:sz w:val="20"/>
+                <w:szCs w:val="20"/>
+              </w:rPr>
+              <w:t xml:space="preserve">Chat</w:t>
+            </w:r>
+          </w:p>
+        </w:tc>
+        <w:tc>
+          <w:p>
+            <w:r>
+              <w:rPr>
+                <w:sz w:val="20"/>
+                <w:szCs w:val="20"/>
+              </w:rPr>
+              <w:t xml:space="preserve">Category order and starter content</w:t>
+            </w:r>
+          </w:p>
+        </w:tc>
+        <w:tc>
+          <w:p>
+            <w:r>
+              <w:rPr>
+                <w:sz w:val="20"/>
+                <w:szCs w:val="20"/>
+              </w:rPr>
+              <w:t xml:space="preserve">P0</w:t>
+            </w:r>
+          </w:p>
+        </w:tc>
+      </w:tr>
+      <w:tr>
+        <w:tc>
+          <w:p>
+            <w:r>
+              <w:rPr>
+                <w:sz w:val="20"/>
+                <w:szCs w:val="20"/>
+              </w:rPr>
+              <w:t xml:space="preserve">MM-QA-040</w:t>
+            </w:r>
+          </w:p>
+        </w:tc>
+        <w:tc>
+          <w:p>
+            <w:r>
+              <w:rPr>
+                <w:sz w:val="20"/>
+                <w:szCs w:val="20"/>
+              </w:rPr>
+              <w:t xml:space="preserve">Chat</w:t>
+            </w:r>
+          </w:p>
+        </w:tc>
+        <w:tc>
+          <w:p>
+            <w:r>
+              <w:rPr>
+                <w:sz w:val="20"/>
+                <w:szCs w:val="20"/>
+              </w:rPr>
+              <w:t xml:space="preserve">Starter inserts without auto-send</w:t>
+            </w:r>
+          </w:p>
+        </w:tc>
+        <w:tc>
+          <w:p>
+            <w:r>
+              <w:rPr>
+                <w:sz w:val="20"/>
+                <w:szCs w:val="20"/>
+              </w:rPr>
+              <w:t xml:space="preserve">P0</w:t>
+            </w:r>
+          </w:p>
+        </w:tc>
+      </w:tr>
+      <w:tr>
+        <w:tc>
+          <w:p>
+            <w:r>
+              <w:rPr>
+                <w:sz w:val="20"/>
+                <w:szCs w:val="20"/>
+              </w:rPr>
+              <w:t xml:space="preserve">MM-QA-041</w:t>
+            </w:r>
+          </w:p>
+        </w:tc>
+        <w:tc>
+          <w:p>
+            <w:r>
+              <w:rPr>
+                <w:sz w:val="20"/>
+                <w:szCs w:val="20"/>
+              </w:rPr>
+              <w:t xml:space="preserve">Chat</w:t>
+            </w:r>
+          </w:p>
+        </w:tc>
+        <w:tc>
+          <w:p>
+            <w:r>
+              <w:rPr>
+                <w:sz w:val="20"/>
+                <w:szCs w:val="20"/>
+              </w:rPr>
+              <w:t xml:space="preserve">Draft replace confirmation</w:t>
+            </w:r>
+          </w:p>
+        </w:tc>
+        <w:tc>
+          <w:p>
+            <w:r>
+              <w:rPr>
+                <w:sz w:val="20"/>
+                <w:szCs w:val="20"/>
+              </w:rPr>
+              <w:t xml:space="preserve">P0</w:t>
+            </w:r>
+          </w:p>
+        </w:tc>
+      </w:tr>
+      <w:tr>
+        <w:tc>
+          <w:p>
+            <w:r>
+              <w:rPr>
+                <w:sz w:val="20"/>
+                <w:szCs w:val="20"/>
+              </w:rPr>
+              <w:t xml:space="preserve">MM-QA-042</w:t>
+            </w:r>
+          </w:p>
+        </w:tc>
+        <w:tc>
+          <w:p>
+            <w:r>
+              <w:rPr>
+                <w:sz w:val="20"/>
+                <w:szCs w:val="20"/>
+              </w:rPr>
+              <w:t xml:space="preserve">Chat</w:t>
+            </w:r>
+          </w:p>
+        </w:tc>
+        <w:tc>
+          <w:p>
+            <w:r>
+              <w:rPr>
+                <w:sz w:val="20"/>
+                <w:szCs w:val="20"/>
+              </w:rPr>
+              <w:t xml:space="preserve">Shared interest personalization</w:t>
+            </w:r>
+          </w:p>
+        </w:tc>
+        <w:tc>
+          <w:p>
+            <w:r>
+              <w:rPr>
+                <w:sz w:val="20"/>
+                <w:szCs w:val="20"/>
+              </w:rPr>
+              <w:t xml:space="preserve">P1</w:t>
+            </w:r>
+          </w:p>
+        </w:tc>
+      </w:tr>
+      <w:tr>
+        <w:tc>
+          <w:p>
+            <w:r>
+              <w:rPr>
+                <w:sz w:val="20"/>
+                <w:szCs w:val="20"/>
+              </w:rPr>
+              <w:t xml:space="preserve">MM-QA-043</w:t>
+            </w:r>
+          </w:p>
+        </w:tc>
+        <w:tc>
+          <w:p>
+            <w:r>
+              <w:rPr>
+                <w:sz w:val="20"/>
+                <w:szCs w:val="20"/>
+              </w:rPr>
+              <w:t xml:space="preserve">Chat</w:t>
+            </w:r>
+          </w:p>
+        </w:tc>
+        <w:tc>
+          <w:p>
+            <w:r>
+              <w:rPr>
+                <w:sz w:val="20"/>
+                <w:szCs w:val="20"/>
+              </w:rPr>
+              <w:t xml:space="preserve">Show more and dismiss</w:t>
+            </w:r>
+          </w:p>
+        </w:tc>
+        <w:tc>
+          <w:p>
+            <w:r>
+              <w:rPr>
+                <w:sz w:val="20"/>
+                <w:szCs w:val="20"/>
+              </w:rPr>
+              <w:t xml:space="preserve">P2</w:t>
+            </w:r>
+          </w:p>
+        </w:tc>
+      </w:tr>
+      <w:tr>
+        <w:tc>
+          <w:p>
+            <w:r>
+              <w:rPr>
+                <w:sz w:val="20"/>
+                <w:szCs w:val="20"/>
+              </w:rPr>
+              <w:t xml:space="preserve">MM-QA-044</w:t>
+            </w:r>
+          </w:p>
+        </w:tc>
+        <w:tc>
+          <w:p>
+            <w:r>
+              <w:rPr>
+                <w:sz w:val="20"/>
+                <w:szCs w:val="20"/>
+              </w:rPr>
+              <w:t xml:space="preserve">Chat</w:t>
+            </w:r>
+          </w:p>
+        </w:tc>
+        <w:tc>
+          <w:p>
+            <w:r>
+              <w:rPr>
+                <w:sz w:val="20"/>
+                <w:szCs w:val="20"/>
+              </w:rPr>
+              <w:t xml:space="preserve">Connection ended while picker open</w:t>
+            </w:r>
+          </w:p>
+        </w:tc>
+        <w:tc>
+          <w:p>
+            <w:r>
+              <w:rPr>
+                <w:sz w:val="20"/>
+                <w:szCs w:val="20"/>
+              </w:rPr>
+              <w:t xml:space="preserve">P1</w:t>
+            </w:r>
+          </w:p>
+        </w:tc>
+      </w:tr>
     </w:tbl>
     <w:p>
       <w:pPr>
@@ -7408,6 +7776,997 @@
       </w:pPr>
       <w:r>
         <w:t xml:space="preserve">MatchMaker icons and chips wrap; no horizontal scroll on values Step 3.</w:t>
+      </w:r>
+    </w:p>
+    <w:p>
+      <w:pPr>
+        <w:spacing w:after="120"/>
+      </w:pPr>
+      <w:r>
+        <w:rPr>
+          <w:i/>
+          <w:iCs/>
+        </w:rPr>
+        <w:t xml:space="preserve">Actual result / status: _________________________________________________</w:t>
+      </w:r>
+    </w:p>
+    <w:p>
+      <w:pPr>
+        <w:spacing w:after="120"/>
+      </w:pPr>
+      <w:r>
+        <w:rPr>
+          <w:i/>
+          <w:iCs/>
+        </w:rPr>
+        <w:t xml:space="preserve">Tester / date: ______________________</w:t>
+      </w:r>
+    </w:p>
+    <w:p>
+      <w:pPr>
+        <w:pStyle w:val="Heading3"/>
+        <w:spacing w:after="120" w:before="240"/>
+      </w:pPr>
+      <w:r>
+        <w:t xml:space="preserve">MM-QA-037: Quick picks entry on MatchMaker thread</w:t>
+      </w:r>
+    </w:p>
+    <w:p>
+      <w:pPr>
+        <w:spacing w:after="120"/>
+      </w:pPr>
+      <w:r>
+        <w:t xml:space="preserve">Area: Chat  |  Priority: P0  |  Spec: Spec §3.3.1</w:t>
+      </w:r>
+    </w:p>
+    <w:p>
+      <w:pPr>
+        <w:spacing w:after="120"/>
+      </w:pPr>
+      <w:r>
+        <w:rPr>
+          <w:b/>
+          <w:bCs/>
+        </w:rPr>
+        <w:t xml:space="preserve">Preconditions:</w:t>
+      </w:r>
+    </w:p>
+    <w:p>
+      <w:pPr>
+        <w:spacing w:after="120"/>
+      </w:pPr>
+      <w:r>
+        <w:t xml:space="preserve">Active MatchMaker connection; 1:1 chat open from Messages.</w:t>
+      </w:r>
+    </w:p>
+    <w:p>
+      <w:pPr>
+        <w:spacing w:after="120"/>
+      </w:pPr>
+      <w:r>
+        <w:rPr>
+          <w:b/>
+          <w:bCs/>
+        </w:rPr>
+        <w:t xml:space="preserve">Test steps:</w:t>
+      </w:r>
+    </w:p>
+    <w:p>
+      <w:pPr>
+        <w:pStyle w:val="ListParagraph"/>
+        <w:numPr>
+          <w:ilvl w:val="0"/>
+          <w:numId w:val="1"/>
+        </w:numPr>
+        <w:spacing w:after="80"/>
+      </w:pPr>
+      <w:r>
+        <w:t xml:space="preserve">1. Open thread with MatchMaker badge.</w:t>
+      </w:r>
+    </w:p>
+    <w:p>
+      <w:pPr>
+        <w:pStyle w:val="ListParagraph"/>
+        <w:numPr>
+          <w:ilvl w:val="0"/>
+          <w:numId w:val="1"/>
+        </w:numPr>
+        <w:spacing w:after="80"/>
+      </w:pPr>
+      <w:r>
+        <w:t xml:space="preserve">2. Locate Quick picks control above composer.</w:t>
+      </w:r>
+    </w:p>
+    <w:p>
+      <w:pPr>
+        <w:spacing w:after="120"/>
+      </w:pPr>
+      <w:r>
+        <w:rPr>
+          <w:b/>
+          <w:bCs/>
+        </w:rPr>
+        <w:t xml:space="preserve">Expected result:</w:t>
+      </w:r>
+    </w:p>
+    <w:p>
+      <w:pPr>
+        <w:spacing w:after="120"/>
+      </w:pPr>
+      <w:r>
+        <w:t xml:space="preserve">Control visible; does not cover Send or attachment controls.</w:t>
+      </w:r>
+    </w:p>
+    <w:p>
+      <w:pPr>
+        <w:spacing w:after="120"/>
+      </w:pPr>
+      <w:r>
+        <w:rPr>
+          <w:i/>
+          <w:iCs/>
+        </w:rPr>
+        <w:t xml:space="preserve">Actual result / status: _________________________________________________</w:t>
+      </w:r>
+    </w:p>
+    <w:p>
+      <w:pPr>
+        <w:spacing w:after="120"/>
+      </w:pPr>
+      <w:r>
+        <w:rPr>
+          <w:i/>
+          <w:iCs/>
+        </w:rPr>
+        <w:t xml:space="preserve">Tester / date: ______________________</w:t>
+      </w:r>
+    </w:p>
+    <w:p>
+      <w:pPr>
+        <w:pStyle w:val="Heading3"/>
+        <w:spacing w:after="120" w:before="240"/>
+      </w:pPr>
+      <w:r>
+        <w:t xml:space="preserve">MM-QA-038: Empty chat helper</w:t>
+      </w:r>
+    </w:p>
+    <w:p>
+      <w:pPr>
+        <w:spacing w:after="120"/>
+      </w:pPr>
+      <w:r>
+        <w:t xml:space="preserve">Area: Chat  |  Priority: P1  |  Spec: Spec §3.3.1</w:t>
+      </w:r>
+    </w:p>
+    <w:p>
+      <w:pPr>
+        <w:spacing w:after="120"/>
+      </w:pPr>
+      <w:r>
+        <w:rPr>
+          <w:b/>
+          <w:bCs/>
+        </w:rPr>
+        <w:t xml:space="preserve">Preconditions:</w:t>
+      </w:r>
+    </w:p>
+    <w:p>
+      <w:pPr>
+        <w:spacing w:after="120"/>
+      </w:pPr>
+      <w:r>
+        <w:t xml:space="preserve">New MatchMaker thread with zero user messages.</w:t>
+      </w:r>
+    </w:p>
+    <w:p>
+      <w:pPr>
+        <w:spacing w:after="120"/>
+      </w:pPr>
+      <w:r>
+        <w:rPr>
+          <w:b/>
+          <w:bCs/>
+        </w:rPr>
+        <w:t xml:space="preserve">Test steps:</w:t>
+      </w:r>
+    </w:p>
+    <w:p>
+      <w:pPr>
+        <w:pStyle w:val="ListParagraph"/>
+        <w:numPr>
+          <w:ilvl w:val="0"/>
+          <w:numId w:val="1"/>
+        </w:numPr>
+        <w:spacing w:after="80"/>
+      </w:pPr>
+      <w:r>
+        <w:t xml:space="preserve">1. Open chat.</w:t>
+      </w:r>
+    </w:p>
+    <w:p>
+      <w:pPr>
+        <w:pStyle w:val="ListParagraph"/>
+        <w:numPr>
+          <w:ilvl w:val="0"/>
+          <w:numId w:val="1"/>
+        </w:numPr>
+        <w:spacing w:after="80"/>
+      </w:pPr>
+      <w:r>
+        <w:t xml:space="preserve">2. Send one message.</w:t>
+      </w:r>
+    </w:p>
+    <w:p>
+      <w:pPr>
+        <w:pStyle w:val="ListParagraph"/>
+        <w:numPr>
+          <w:ilvl w:val="0"/>
+          <w:numId w:val="1"/>
+        </w:numPr>
+        <w:spacing w:after="80"/>
+      </w:pPr>
+      <w:r>
+        <w:t xml:space="preserve">3. Re-open with empty composer on new connection.</w:t>
+      </w:r>
+    </w:p>
+    <w:p>
+      <w:pPr>
+        <w:spacing w:after="120"/>
+      </w:pPr>
+      <w:r>
+        <w:rPr>
+          <w:b/>
+          <w:bCs/>
+        </w:rPr>
+        <w:t xml:space="preserve">Expected result:</w:t>
+      </w:r>
+    </w:p>
+    <w:p>
+      <w:pPr>
+        <w:spacing w:after="120"/>
+      </w:pPr>
+      <w:r>
+        <w:t xml:space="preserve">Helper shows only when no messages and composer empty; hides after first message.</w:t>
+      </w:r>
+    </w:p>
+    <w:p>
+      <w:pPr>
+        <w:spacing w:after="120"/>
+      </w:pPr>
+      <w:r>
+        <w:rPr>
+          <w:i/>
+          <w:iCs/>
+        </w:rPr>
+        <w:t xml:space="preserve">Actual result / status: _________________________________________________</w:t>
+      </w:r>
+    </w:p>
+    <w:p>
+      <w:pPr>
+        <w:spacing w:after="120"/>
+      </w:pPr>
+      <w:r>
+        <w:rPr>
+          <w:i/>
+          <w:iCs/>
+        </w:rPr>
+        <w:t xml:space="preserve">Tester / date: ______________________</w:t>
+      </w:r>
+    </w:p>
+    <w:p>
+      <w:pPr>
+        <w:pStyle w:val="Heading3"/>
+        <w:spacing w:after="120" w:before="240"/>
+      </w:pPr>
+      <w:r>
+        <w:t xml:space="preserve">MM-QA-039: Category order and starter content</w:t>
+      </w:r>
+    </w:p>
+    <w:p>
+      <w:pPr>
+        <w:spacing w:after="120"/>
+      </w:pPr>
+      <w:r>
+        <w:t xml:space="preserve">Area: Chat  |  Priority: P0  |  Spec: Spec §3.3.1</w:t>
+      </w:r>
+    </w:p>
+    <w:p>
+      <w:pPr>
+        <w:spacing w:after="120"/>
+      </w:pPr>
+      <w:r>
+        <w:rPr>
+          <w:b/>
+          <w:bCs/>
+        </w:rPr>
+        <w:t xml:space="preserve">Preconditions:</w:t>
+      </w:r>
+    </w:p>
+    <w:p>
+      <w:pPr>
+        <w:spacing w:after="120"/>
+      </w:pPr>
+      <w:r>
+        <w:t xml:space="preserve">Quick picks open.</w:t>
+      </w:r>
+    </w:p>
+    <w:p>
+      <w:pPr>
+        <w:spacing w:after="120"/>
+      </w:pPr>
+      <w:r>
+        <w:rPr>
+          <w:b/>
+          <w:bCs/>
+        </w:rPr>
+        <w:t xml:space="preserve">Test steps:</w:t>
+      </w:r>
+    </w:p>
+    <w:p>
+      <w:pPr>
+        <w:pStyle w:val="ListParagraph"/>
+        <w:numPr>
+          <w:ilvl w:val="0"/>
+          <w:numId w:val="1"/>
+        </w:numPr>
+        <w:spacing w:after="80"/>
+      </w:pPr>
+      <w:r>
+        <w:t xml:space="preserve">1. Verify chip order matches spec.</w:t>
+      </w:r>
+    </w:p>
+    <w:p>
+      <w:pPr>
+        <w:pStyle w:val="ListParagraph"/>
+        <w:numPr>
+          <w:ilvl w:val="0"/>
+          <w:numId w:val="1"/>
+        </w:numPr>
+        <w:spacing w:after="80"/>
+      </w:pPr>
+      <w:r>
+        <w:t xml:space="preserve">2. Spot-check five lines per category.</w:t>
+      </w:r>
+    </w:p>
+    <w:p>
+      <w:pPr>
+        <w:spacing w:after="120"/>
+      </w:pPr>
+      <w:r>
+        <w:rPr>
+          <w:b/>
+          <w:bCs/>
+        </w:rPr>
+        <w:t xml:space="preserve">Expected result:</w:t>
+      </w:r>
+    </w:p>
+    <w:p>
+      <w:pPr>
+        <w:spacing w:after="120"/>
+      </w:pPr>
+      <w:r>
+        <w:t xml:space="preserve">Eight categories in spec order; curated copy matches library; no private fields shown.</w:t>
+      </w:r>
+    </w:p>
+    <w:p>
+      <w:pPr>
+        <w:spacing w:after="120"/>
+      </w:pPr>
+      <w:r>
+        <w:rPr>
+          <w:i/>
+          <w:iCs/>
+        </w:rPr>
+        <w:t xml:space="preserve">Actual result / status: _________________________________________________</w:t>
+      </w:r>
+    </w:p>
+    <w:p>
+      <w:pPr>
+        <w:spacing w:after="120"/>
+      </w:pPr>
+      <w:r>
+        <w:rPr>
+          <w:i/>
+          <w:iCs/>
+        </w:rPr>
+        <w:t xml:space="preserve">Tester / date: ______________________</w:t>
+      </w:r>
+    </w:p>
+    <w:p>
+      <w:pPr>
+        <w:pStyle w:val="Heading3"/>
+        <w:spacing w:after="120" w:before="240"/>
+      </w:pPr>
+      <w:r>
+        <w:t xml:space="preserve">MM-QA-040: Starter inserts without auto-send</w:t>
+      </w:r>
+    </w:p>
+    <w:p>
+      <w:pPr>
+        <w:spacing w:after="120"/>
+      </w:pPr>
+      <w:r>
+        <w:t xml:space="preserve">Area: Chat  |  Priority: P0  |  Spec: Spec §3.3.1</w:t>
+      </w:r>
+    </w:p>
+    <w:p>
+      <w:pPr>
+        <w:spacing w:after="120"/>
+      </w:pPr>
+      <w:r>
+        <w:rPr>
+          <w:b/>
+          <w:bCs/>
+        </w:rPr>
+        <w:t xml:space="preserve">Preconditions:</w:t>
+      </w:r>
+    </w:p>
+    <w:p>
+      <w:pPr>
+        <w:spacing w:after="120"/>
+      </w:pPr>
+      <w:r>
+        <w:t xml:space="preserve">Empty composer.</w:t>
+      </w:r>
+    </w:p>
+    <w:p>
+      <w:pPr>
+        <w:spacing w:after="120"/>
+      </w:pPr>
+      <w:r>
+        <w:rPr>
+          <w:b/>
+          <w:bCs/>
+        </w:rPr>
+        <w:t xml:space="preserve">Test steps:</w:t>
+      </w:r>
+    </w:p>
+    <w:p>
+      <w:pPr>
+        <w:pStyle w:val="ListParagraph"/>
+        <w:numPr>
+          <w:ilvl w:val="0"/>
+          <w:numId w:val="1"/>
+        </w:numPr>
+        <w:spacing w:after="80"/>
+      </w:pPr>
+      <w:r>
+        <w:t xml:space="preserve">1. Pick a starter.</w:t>
+      </w:r>
+    </w:p>
+    <w:p>
+      <w:pPr>
+        <w:pStyle w:val="ListParagraph"/>
+        <w:numPr>
+          <w:ilvl w:val="0"/>
+          <w:numId w:val="1"/>
+        </w:numPr>
+        <w:spacing w:after="80"/>
+      </w:pPr>
+      <w:r>
+        <w:t xml:space="preserve">2. Observe composer and message list before Send.</w:t>
+      </w:r>
+    </w:p>
+    <w:p>
+      <w:pPr>
+        <w:spacing w:after="120"/>
+      </w:pPr>
+      <w:r>
+        <w:rPr>
+          <w:b/>
+          <w:bCs/>
+        </w:rPr>
+        <w:t xml:space="preserve">Expected result:</w:t>
+      </w:r>
+    </w:p>
+    <w:p>
+      <w:pPr>
+        <w:spacing w:after="120"/>
+      </w:pPr>
+      <w:r>
+        <w:t xml:space="preserve">Text in composer only; no new message row until Send.</w:t>
+      </w:r>
+    </w:p>
+    <w:p>
+      <w:pPr>
+        <w:spacing w:after="120"/>
+      </w:pPr>
+      <w:r>
+        <w:rPr>
+          <w:i/>
+          <w:iCs/>
+        </w:rPr>
+        <w:t xml:space="preserve">Actual result / status: _________________________________________________</w:t>
+      </w:r>
+    </w:p>
+    <w:p>
+      <w:pPr>
+        <w:spacing w:after="120"/>
+      </w:pPr>
+      <w:r>
+        <w:rPr>
+          <w:i/>
+          <w:iCs/>
+        </w:rPr>
+        <w:t xml:space="preserve">Tester / date: ______________________</w:t>
+      </w:r>
+    </w:p>
+    <w:p>
+      <w:pPr>
+        <w:pStyle w:val="Heading3"/>
+        <w:spacing w:after="120" w:before="240"/>
+      </w:pPr>
+      <w:r>
+        <w:t xml:space="preserve">MM-QA-041: Draft replace confirmation</w:t>
+      </w:r>
+    </w:p>
+    <w:p>
+      <w:pPr>
+        <w:spacing w:after="120"/>
+      </w:pPr>
+      <w:r>
+        <w:t xml:space="preserve">Area: Chat  |  Priority: P0  |  Spec: Spec §3.3.1</w:t>
+      </w:r>
+    </w:p>
+    <w:p>
+      <w:pPr>
+        <w:spacing w:after="120"/>
+      </w:pPr>
+      <w:r>
+        <w:rPr>
+          <w:b/>
+          <w:bCs/>
+        </w:rPr>
+        <w:t xml:space="preserve">Preconditions:</w:t>
+      </w:r>
+    </w:p>
+    <w:p>
+      <w:pPr>
+        <w:spacing w:after="120"/>
+      </w:pPr>
+      <w:r>
+        <w:t xml:space="preserve">Composer contains unsent text.</w:t>
+      </w:r>
+    </w:p>
+    <w:p>
+      <w:pPr>
+        <w:spacing w:after="120"/>
+      </w:pPr>
+      <w:r>
+        <w:rPr>
+          <w:b/>
+          <w:bCs/>
+        </w:rPr>
+        <w:t xml:space="preserve">Test steps:</w:t>
+      </w:r>
+    </w:p>
+    <w:p>
+      <w:pPr>
+        <w:pStyle w:val="ListParagraph"/>
+        <w:numPr>
+          <w:ilvl w:val="0"/>
+          <w:numId w:val="1"/>
+        </w:numPr>
+        <w:spacing w:after="80"/>
+      </w:pPr>
+      <w:r>
+        <w:t xml:space="preserve">1. Open Quick picks.</w:t>
+      </w:r>
+    </w:p>
+    <w:p>
+      <w:pPr>
+        <w:pStyle w:val="ListParagraph"/>
+        <w:numPr>
+          <w:ilvl w:val="0"/>
+          <w:numId w:val="1"/>
+        </w:numPr>
+        <w:spacing w:after="80"/>
+      </w:pPr>
+      <w:r>
+        <w:t xml:space="preserve">2. Select starter.</w:t>
+      </w:r>
+    </w:p>
+    <w:p>
+      <w:pPr>
+        <w:pStyle w:val="ListParagraph"/>
+        <w:numPr>
+          <w:ilvl w:val="0"/>
+          <w:numId w:val="1"/>
+        </w:numPr>
+        <w:spacing w:after="80"/>
+      </w:pPr>
+      <w:r>
+        <w:t xml:space="preserve">3. Choose Keep draft.</w:t>
+      </w:r>
+    </w:p>
+    <w:p>
+      <w:pPr>
+        <w:pStyle w:val="ListParagraph"/>
+        <w:numPr>
+          <w:ilvl w:val="0"/>
+          <w:numId w:val="1"/>
+        </w:numPr>
+        <w:spacing w:after="80"/>
+      </w:pPr>
+      <w:r>
+        <w:t xml:space="preserve">4. Repeat and Replace.</w:t>
+      </w:r>
+    </w:p>
+    <w:p>
+      <w:pPr>
+        <w:spacing w:after="120"/>
+      </w:pPr>
+      <w:r>
+        <w:rPr>
+          <w:b/>
+          <w:bCs/>
+        </w:rPr>
+        <w:t xml:space="preserve">Expected result:</w:t>
+      </w:r>
+    </w:p>
+    <w:p>
+      <w:pPr>
+        <w:spacing w:after="120"/>
+      </w:pPr>
+      <w:r>
+        <w:t xml:space="preserve">Keep draft preserves text; Replace overwrites; neither path auto-sends.</w:t>
+      </w:r>
+    </w:p>
+    <w:p>
+      <w:pPr>
+        <w:spacing w:after="120"/>
+      </w:pPr>
+      <w:r>
+        <w:rPr>
+          <w:i/>
+          <w:iCs/>
+        </w:rPr>
+        <w:t xml:space="preserve">Actual result / status: _________________________________________________</w:t>
+      </w:r>
+    </w:p>
+    <w:p>
+      <w:pPr>
+        <w:spacing w:after="120"/>
+      </w:pPr>
+      <w:r>
+        <w:rPr>
+          <w:i/>
+          <w:iCs/>
+        </w:rPr>
+        <w:t xml:space="preserve">Tester / date: ______________________</w:t>
+      </w:r>
+    </w:p>
+    <w:p>
+      <w:pPr>
+        <w:pStyle w:val="Heading3"/>
+        <w:spacing w:after="120" w:before="240"/>
+      </w:pPr>
+      <w:r>
+        <w:t xml:space="preserve">MM-QA-042: Shared interest personalization</w:t>
+      </w:r>
+    </w:p>
+    <w:p>
+      <w:pPr>
+        <w:spacing w:after="120"/>
+      </w:pPr>
+      <w:r>
+        <w:t xml:space="preserve">Area: Chat  |  Priority: P1  |  Spec: Spec §3.3.1</w:t>
+      </w:r>
+    </w:p>
+    <w:p>
+      <w:pPr>
+        <w:spacing w:after="120"/>
+      </w:pPr>
+      <w:r>
+        <w:rPr>
+          <w:b/>
+          <w:bCs/>
+        </w:rPr>
+        <w:t xml:space="preserve">Preconditions:</w:t>
+      </w:r>
+    </w:p>
+    <w:p>
+      <w:pPr>
+        <w:spacing w:after="120"/>
+      </w:pPr>
+      <w:r>
+        <w:t xml:space="preserve">Both profiles share a public interest tag.</w:t>
+      </w:r>
+    </w:p>
+    <w:p>
+      <w:pPr>
+        <w:spacing w:after="120"/>
+      </w:pPr>
+      <w:r>
+        <w:rPr>
+          <w:b/>
+          <w:bCs/>
+        </w:rPr>
+        <w:t xml:space="preserve">Test steps:</w:t>
+      </w:r>
+    </w:p>
+    <w:p>
+      <w:pPr>
+        <w:pStyle w:val="ListParagraph"/>
+        <w:numPr>
+          <w:ilvl w:val="0"/>
+          <w:numId w:val="1"/>
+        </w:numPr>
+        <w:spacing w:after="80"/>
+      </w:pPr>
+      <w:r>
+        <w:t xml:space="preserve">1. Open Based on Shared Interests.</w:t>
+      </w:r>
+    </w:p>
+    <w:p>
+      <w:pPr>
+        <w:pStyle w:val="ListParagraph"/>
+        <w:numPr>
+          <w:ilvl w:val="0"/>
+          <w:numId w:val="1"/>
+        </w:numPr>
+        <w:spacing w:after="80"/>
+      </w:pPr>
+      <w:r>
+        <w:t xml:space="preserve">2. Compare with account lacking overlap.</w:t>
+      </w:r>
+    </w:p>
+    <w:p>
+      <w:pPr>
+        <w:spacing w:after="120"/>
+      </w:pPr>
+      <w:r>
+        <w:rPr>
+          <w:b/>
+          <w:bCs/>
+        </w:rPr>
+        <w:t xml:space="preserve">Expected result:</w:t>
+      </w:r>
+    </w:p>
+    <w:p>
+      <w:pPr>
+        <w:spacing w:after="120"/>
+      </w:pPr>
+      <w:r>
+        <w:t xml:space="preserve">Overlap case names real shared tag; no overlap uses generic lines only.</w:t>
+      </w:r>
+    </w:p>
+    <w:p>
+      <w:pPr>
+        <w:spacing w:after="120"/>
+      </w:pPr>
+      <w:r>
+        <w:rPr>
+          <w:i/>
+          <w:iCs/>
+        </w:rPr>
+        <w:t xml:space="preserve">Actual result / status: _________________________________________________</w:t>
+      </w:r>
+    </w:p>
+    <w:p>
+      <w:pPr>
+        <w:spacing w:after="120"/>
+      </w:pPr>
+      <w:r>
+        <w:rPr>
+          <w:i/>
+          <w:iCs/>
+        </w:rPr>
+        <w:t xml:space="preserve">Tester / date: ______________________</w:t>
+      </w:r>
+    </w:p>
+    <w:p>
+      <w:pPr>
+        <w:pStyle w:val="Heading3"/>
+        <w:spacing w:after="120" w:before="240"/>
+      </w:pPr>
+      <w:r>
+        <w:t xml:space="preserve">MM-QA-043: Show more and dismiss</w:t>
+      </w:r>
+    </w:p>
+    <w:p>
+      <w:pPr>
+        <w:spacing w:after="120"/>
+      </w:pPr>
+      <w:r>
+        <w:t xml:space="preserve">Area: Chat  |  Priority: P2  |  Spec: Spec §3.3.1</w:t>
+      </w:r>
+    </w:p>
+    <w:p>
+      <w:pPr>
+        <w:spacing w:after="120"/>
+      </w:pPr>
+      <w:r>
+        <w:rPr>
+          <w:b/>
+          <w:bCs/>
+        </w:rPr>
+        <w:t xml:space="preserve">Preconditions:</w:t>
+      </w:r>
+    </w:p>
+    <w:p>
+      <w:pPr>
+        <w:spacing w:after="120"/>
+      </w:pPr>
+      <w:r>
+        <w:t xml:space="preserve">Quick picks open.</w:t>
+      </w:r>
+    </w:p>
+    <w:p>
+      <w:pPr>
+        <w:spacing w:after="120"/>
+      </w:pPr>
+      <w:r>
+        <w:rPr>
+          <w:b/>
+          <w:bCs/>
+        </w:rPr>
+        <w:t xml:space="preserve">Test steps:</w:t>
+      </w:r>
+    </w:p>
+    <w:p>
+      <w:pPr>
+        <w:pStyle w:val="ListParagraph"/>
+        <w:numPr>
+          <w:ilvl w:val="0"/>
+          <w:numId w:val="1"/>
+        </w:numPr>
+        <w:spacing w:after="80"/>
+      </w:pPr>
+      <w:r>
+        <w:t xml:space="preserve">1. Tap Show more twice.</w:t>
+      </w:r>
+    </w:p>
+    <w:p>
+      <w:pPr>
+        <w:pStyle w:val="ListParagraph"/>
+        <w:numPr>
+          <w:ilvl w:val="0"/>
+          <w:numId w:val="1"/>
+        </w:numPr>
+        <w:spacing w:after="80"/>
+      </w:pPr>
+      <w:r>
+        <w:t xml:space="preserve">2. Dismiss via backdrop and Escape.</w:t>
+      </w:r>
+    </w:p>
+    <w:p>
+      <w:pPr>
+        <w:spacing w:after="120"/>
+      </w:pPr>
+      <w:r>
+        <w:rPr>
+          <w:b/>
+          <w:bCs/>
+        </w:rPr>
+        <w:t xml:space="preserve">Expected result:</w:t>
+      </w:r>
+    </w:p>
+    <w:p>
+      <w:pPr>
+        <w:spacing w:after="120"/>
+      </w:pPr>
+      <w:r>
+        <w:t xml:space="preserve">Different starters shown when possible; dismiss leaves composer unchanged.</w:t>
+      </w:r>
+    </w:p>
+    <w:p>
+      <w:pPr>
+        <w:spacing w:after="120"/>
+      </w:pPr>
+      <w:r>
+        <w:rPr>
+          <w:i/>
+          <w:iCs/>
+        </w:rPr>
+        <w:t xml:space="preserve">Actual result / status: _________________________________________________</w:t>
+      </w:r>
+    </w:p>
+    <w:p>
+      <w:pPr>
+        <w:spacing w:after="120"/>
+      </w:pPr>
+      <w:r>
+        <w:rPr>
+          <w:i/>
+          <w:iCs/>
+        </w:rPr>
+        <w:t xml:space="preserve">Tester / date: ______________________</w:t>
+      </w:r>
+    </w:p>
+    <w:p>
+      <w:pPr>
+        <w:pStyle w:val="Heading3"/>
+        <w:spacing w:after="120" w:before="240"/>
+      </w:pPr>
+      <w:r>
+        <w:t xml:space="preserve">MM-QA-044: Connection ended while picker open</w:t>
+      </w:r>
+    </w:p>
+    <w:p>
+      <w:pPr>
+        <w:spacing w:after="120"/>
+      </w:pPr>
+      <w:r>
+        <w:t xml:space="preserve">Area: Chat  |  Priority: P1  |  Spec: Spec §3.3.1</w:t>
+      </w:r>
+    </w:p>
+    <w:p>
+      <w:pPr>
+        <w:spacing w:after="120"/>
+      </w:pPr>
+      <w:r>
+        <w:rPr>
+          <w:b/>
+          <w:bCs/>
+        </w:rPr>
+        <w:t xml:space="preserve">Preconditions:</w:t>
+      </w:r>
+    </w:p>
+    <w:p>
+      <w:pPr>
+        <w:spacing w:after="120"/>
+      </w:pPr>
+      <w:r>
+        <w:t xml:space="preserve">Second session or admin ends connection.</w:t>
+      </w:r>
+    </w:p>
+    <w:p>
+      <w:pPr>
+        <w:spacing w:after="120"/>
+      </w:pPr>
+      <w:r>
+        <w:rPr>
+          <w:b/>
+          <w:bCs/>
+        </w:rPr>
+        <w:t xml:space="preserve">Test steps:</w:t>
+      </w:r>
+    </w:p>
+    <w:p>
+      <w:pPr>
+        <w:pStyle w:val="ListParagraph"/>
+        <w:numPr>
+          <w:ilvl w:val="0"/>
+          <w:numId w:val="1"/>
+        </w:numPr>
+        <w:spacing w:after="80"/>
+      </w:pPr>
+      <w:r>
+        <w:t xml:space="preserve">1. Open Quick picks.</w:t>
+      </w:r>
+    </w:p>
+    <w:p>
+      <w:pPr>
+        <w:pStyle w:val="ListParagraph"/>
+        <w:numPr>
+          <w:ilvl w:val="0"/>
+          <w:numId w:val="1"/>
+        </w:numPr>
+        <w:spacing w:after="80"/>
+      </w:pPr>
+      <w:r>
+        <w:t xml:space="preserve">2. End connection from other user or status change.</w:t>
+      </w:r>
+    </w:p>
+    <w:p>
+      <w:pPr>
+        <w:spacing w:after="120"/>
+      </w:pPr>
+      <w:r>
+        <w:rPr>
+          <w:b/>
+          <w:bCs/>
+        </w:rPr>
+        <w:t xml:space="preserve">Expected result:</w:t>
+      </w:r>
+    </w:p>
+    <w:p>
+      <w:pPr>
+        <w:spacing w:after="120"/>
+      </w:pPr>
+      <w:r>
+        <w:t xml:space="preserve">Sheet closes; Quick picks hidden; send rules follow existing chat policy.</w:t>
       </w:r>
     </w:p>
     <w:p>

</xml_diff>